<commit_message>
Update dispatchers, agent prompts, and inter-panel utils
- Expand inter_panel_utils with complex rule handling (+594 lines)
- Update session_based_dispatcher and inter_panel_dispatcher logic
- Add stream_utils for real-time claude subprocess output parsing
- Improve expression rule and inter-panel detect refs agent prompts
- Add copilot-instructions and expression rules CSV example
- Standardize dispatcher patterns across all stage dispatchers

Co-Authored-By: Claude Opus 4.6 <noreply@anthropic.com>
</commit_message>
<xml_diff>
--- a/documents/Pidilite Vendor block-unblock BUD_modified.docx
+++ b/documents/Pidilite Vendor block-unblock BUD_modified.docx
@@ -7198,7 +7198,17 @@
               <w:br/>
               <w:t>False</w:t>
               <w:br/>
-              <w:t>if field "Which function you would like to Update?" value is "Block / Unblock posting all company code" then it is mandatory, otherwise it is non mandatory. This should not be the same value as posting block old field, else an error should be shown.</w:t>
+              <w:t xml:space="preserve">if field "Which function you would like to Update?" value is "Block / Unblock posting all company code" then it is mandatory, otherwise it is non mandatory. This should not be the same value as posting block old field, else an error should be shown. </w:t>
+            </w:r>
+            <w:r>
+              <w:rPr>
+                <w:rFonts w:eastAsia="Times New Roman" w:cs="Calibri" w:ascii="Calibri" w:hAnsi="Calibri"/>
+                <w:color w:val="000000"/>
+                <w:sz w:val="24"/>
+                <w:szCs w:val="24"/>
+                <w:lang w:val="en-IN" w:eastAsia="en-IN"/>
+              </w:rPr>
+              <w:t>TRUE_FALSE EDV Reference Table should be used.</w:t>
             </w:r>
           </w:p>
         </w:tc>
@@ -8407,7 +8417,17 @@
               <w:br/>
               <w:t>False</w:t>
               <w:br/>
-              <w:t>if field "Which function you would like to Update?" value is "Block / Unblock posting selected company code then it is mandatory, otherwise it is non-mandatory. This should not be the same value as posting block old field, else an error should be shown.</w:t>
+              <w:t xml:space="preserve">if field "Which function you would like to Update?" value is "Block / Unblock posting selected company code then it is mandatory, otherwise it is non-mandatory. This should not be the same value as posting block old field, else an error should be shown. </w:t>
+            </w:r>
+            <w:r>
+              <w:rPr>
+                <w:rFonts w:eastAsia="Times New Roman" w:cs="Calibri" w:ascii="Calibri" w:hAnsi="Calibri"/>
+                <w:color w:val="000000"/>
+                <w:sz w:val="24"/>
+                <w:szCs w:val="24"/>
+                <w:lang w:val="en-IN" w:eastAsia="en-IN"/>
+              </w:rPr>
+              <w:t>TRUE_FALSE EDV Reference Table should be used.</w:t>
             </w:r>
           </w:p>
         </w:tc>
@@ -9609,7 +9629,17 @@
               <w:br/>
               <w:t>False</w:t>
               <w:br/>
-              <w:t>if field "Which function you would like to Update? value is "Block / Unblock Payment selected company code then it is mandatory, otherwise it is non-mandatory. This should not be the same value as payment block old field, else an error should be shown.</w:t>
+              <w:t xml:space="preserve">if field "Which function you would like to Update? value is "Block / Unblock Payment selected company code then it is mandatory, otherwise it is non-mandatory. This should not be the same value as payment block old field, else an error should be shown. </w:t>
+            </w:r>
+            <w:r>
+              <w:rPr>
+                <w:rFonts w:eastAsia="Times New Roman" w:cs="Calibri" w:ascii="Calibri" w:hAnsi="Calibri"/>
+                <w:color w:val="000000"/>
+                <w:sz w:val="24"/>
+                <w:szCs w:val="24"/>
+                <w:lang w:val="en-IN" w:eastAsia="en-IN"/>
+              </w:rPr>
+              <w:t>TRUE_FALSE EDV Reference Table should be used.</w:t>
             </w:r>
           </w:p>
         </w:tc>
@@ -10818,7 +10848,17 @@
               <w:br/>
               <w:t>False</w:t>
               <w:br/>
-              <w:t>if field "Which function you would like to Update? value is "Block / Unblock Payment selected company code then it is mandatory, otherwise it is non-mandatory. This should not be the same value as payment block old field, else an error should be shown.</w:t>
+              <w:t xml:space="preserve">if field "Which function you would like to Update? value is "Block / Unblock Payment selected company code then it is mandatory, otherwise it is non-mandatory. This should not be the same value as payment block old field, else an error should be shown. </w:t>
+            </w:r>
+            <w:r>
+              <w:rPr>
+                <w:rFonts w:eastAsia="Times New Roman" w:cs="Calibri" w:ascii="Calibri" w:hAnsi="Calibri"/>
+                <w:color w:val="000000"/>
+                <w:sz w:val="24"/>
+                <w:szCs w:val="24"/>
+                <w:lang w:val="en-IN" w:eastAsia="en-IN"/>
+              </w:rPr>
+              <w:t>TRUE_FALSE EDV Reference Table should be used.</w:t>
             </w:r>
           </w:p>
         </w:tc>
@@ -12170,7 +12210,17 @@
               <w:br/>
               <w:t>False</w:t>
               <w:br/>
-              <w:t>if field "Which function you would like to Update? value is " Block / Unblock purchase Org all company code then it is mandatory, otherwise it is non-mandatory. This should not be the same value as Purchase org old field, else an error should be shown.</w:t>
+              <w:t xml:space="preserve">if field "Which function you would like to Update? value is " Block / Unblock purchase Org all company code then it is mandatory, otherwise it is non-mandatory. This should not be the same value as Purchase org old field, else an error should be shown. </w:t>
+            </w:r>
+            <w:r>
+              <w:rPr>
+                <w:rFonts w:eastAsia="Times New Roman" w:cs="Calibri" w:ascii="Calibri" w:hAnsi="Calibri"/>
+                <w:color w:val="000000"/>
+                <w:sz w:val="24"/>
+                <w:szCs w:val="24"/>
+                <w:lang w:val="en-IN" w:eastAsia="en-IN"/>
+              </w:rPr>
+              <w:t>TRUE_FALSE EDV Reference Table should be used.</w:t>
             </w:r>
           </w:p>
         </w:tc>
@@ -13510,6 +13560,7 @@
                 <w:color w:val="000000"/>
                 <w:sz w:val="24"/>
                 <w:szCs w:val="24"/>
+                <w:u w:val="double"/>
                 <w:lang w:val="en-IN" w:eastAsia="en-IN"/>
               </w:rPr>
             </w:pPr>
@@ -13527,7 +13578,17 @@
               <w:br/>
               <w:t>False</w:t>
               <w:br/>
-              <w:t>if field "Which function you would like to Update? value is " Block / Unblock purchase Org selected company code then it is mandatory, otherwise it is non-mandatory. This field should not be same as Purchase org old, an error should be shown if it is same as Purchase org old field.</w:t>
+              <w:t xml:space="preserve">if field "Which function you would like to Update? value is " Block / Unblock purchase Org selected company code then it is mandatory, otherwise it is non-mandatory. This field should not be same as Purchase org old, an error should be shown if it is same as Purchase org old field. </w:t>
+            </w:r>
+            <w:r>
+              <w:rPr>
+                <w:rFonts w:eastAsia="Times New Roman" w:cs="Calibri" w:ascii="Calibri" w:hAnsi="Calibri"/>
+                <w:color w:val="000000"/>
+                <w:sz w:val="24"/>
+                <w:szCs w:val="24"/>
+                <w:lang w:val="en-IN" w:eastAsia="en-IN"/>
+              </w:rPr>
+              <w:t>TRUE_FALSE EDV Reference Table should be used.</w:t>
             </w:r>
           </w:p>
         </w:tc>
@@ -31043,7 +31104,7 @@
           <v:shape id="ole_rId5" type="_x0000_tole_rId5" style="width:75.4pt;height:49.2pt;mso-wrap-distance-right:0pt" filled="f" o:ole="">
             <v:imagedata r:id="rId6" o:title=""/>
           </v:shape>
-          <o:OLEObject Type="Embed" ProgID="" ShapeID="ole_rId5" DrawAspect="Icon" ObjectID="_2130438250" r:id="rId5"/>
+          <o:OLEObject Type="Embed" ProgID="" ShapeID="ole_rId5" DrawAspect="Icon" ObjectID="_1240150902" r:id="rId5"/>
         </w:object>
       </w:r>
     </w:p>
@@ -31120,7 +31181,7 @@
           <v:shape id="ole_rId7" type="_x0000_tole_rId7" style="width:75.4pt;height:49.2pt;mso-wrap-distance-right:0pt" filled="f" o:ole="">
             <v:imagedata r:id="rId8" o:title=""/>
           </v:shape>
-          <o:OLEObject Type="Embed" ProgID="" ShapeID="ole_rId7" DrawAspect="Icon" ObjectID="_28629208" r:id="rId7"/>
+          <o:OLEObject Type="Embed" ProgID="" ShapeID="ole_rId7" DrawAspect="Icon" ObjectID="_154399650" r:id="rId7"/>
         </w:object>
       </w:r>
     </w:p>
@@ -31197,7 +31258,7 @@
           <v:shape id="ole_rId9" type="_x0000_tole_rId9" style="width:75.4pt;height:49.2pt;mso-wrap-distance-right:0pt" filled="f" o:ole="">
             <v:imagedata r:id="rId10" o:title=""/>
           </v:shape>
-          <o:OLEObject Type="Embed" ProgID="" ShapeID="ole_rId9" DrawAspect="Icon" ObjectID="_1059833980" r:id="rId9"/>
+          <o:OLEObject Type="Embed" ProgID="" ShapeID="ole_rId9" DrawAspect="Icon" ObjectID="_793438550" r:id="rId9"/>
         </w:object>
       </w:r>
     </w:p>
@@ -31276,7 +31337,7 @@
           <v:shape id="ole_rId11" type="_x0000_tole_rId11" style="width:75.4pt;height:49.2pt;mso-wrap-distance-right:0pt" filled="f" o:ole="">
             <v:imagedata r:id="rId12" o:title=""/>
           </v:shape>
-          <o:OLEObject Type="Embed" ProgID="" ShapeID="ole_rId11" DrawAspect="Icon" ObjectID="_2145384210" r:id="rId11"/>
+          <o:OLEObject Type="Embed" ProgID="" ShapeID="ole_rId11" DrawAspect="Icon" ObjectID="_1990068585" r:id="rId11"/>
         </w:object>
       </w:r>
     </w:p>

</xml_diff>